<commit_message>
Synchronize reviewed figures, captions, supplementary tables and analysis provenance
Preserve frozen source data and v1.1.0. Add retained STAR/featureCounts evidence and portable extraction of 32 plant clusters. Update figure readability, canonical captions, previews, documentation and checksums without refitting analyses.
</commit_message>
<xml_diff>
--- a/Main_Figures/Main_Figure_Captions.docx
+++ b/Main_Figures/Main_Figure_Captions.docx
@@ -7,856 +7,402 @@
         <w:pStyle w:val="Title"/>
       </w:pPr>
       <w:r>
+        <w:rPr>
+          <w:rFonts w:ascii="Times New Roman" w:hAnsi="Times New Roman"/>
+          <w:sz w:val="28"/>
+        </w:rPr>
         <w:t>Main figure captions</w:t>
       </w:r>
     </w:p>
     <w:p>
       <w:pPr>
         <w:pStyle w:val="Caption"/>
-        <w:keepNext w:val="0"/>
-        <w:keepLines/>
-        <w:spacing w:line="276" w:lineRule="auto" w:before="0" w:after="160"/>
-        <w:rPr>
-          <w:rFonts w:ascii="Times New Roman" w:hAnsi="Times New Roman" w:cs="Times New Roman"/>
-        </w:rPr>
       </w:pPr>
       <w:r>
         <w:rPr>
-          <w:rFonts w:ascii="Times New Roman" w:hAnsi="Times New Roman" w:cs="Times New Roman"/>
-          <w:sz w:val="22"/>
+          <w:b w:val="0"/>
+          <w:i w:val="0"/>
         </w:rPr>
-        <w:t>Fig.</w:t>
+        <w:t xml:space="preserve">Fig. 1. Study system and experimental design. (a) </w:t>
       </w:r>
       <w:r>
         <w:rPr>
-          <w:rFonts w:ascii="Times New Roman" w:hAnsi="Times New Roman" w:cs="Times New Roman"/>
-          <w:sz w:val="22"/>
+          <w:b w:val="0"/>
+          <w:i/>
         </w:rPr>
-        <w:t xml:space="preserve"> 1. </w:t>
+        <w:t>E</w:t>
       </w:r>
       <w:r>
         <w:rPr>
-          <w:rFonts w:ascii="Times New Roman" w:eastAsia="Times New Roman" w:hAnsi="Times New Roman" w:cs="Times New Roman"/>
-          <w:color w:val="000000"/>
-          <w:sz w:val="22"/>
-          <w:szCs w:val="22"/>
-          <w:lang w:eastAsia="en-US"/>
-          <w14:ligatures w14:val="none"/>
+          <w:b w:val="0"/>
+          <w:i/>
         </w:rPr>
-        <w:t xml:space="preserve">Study system and experimental design. (a) </w:t>
+        <w:t>.</w:t>
       </w:r>
       <w:r>
         <w:rPr>
-          <w:rFonts w:ascii="Times New Roman" w:eastAsia="Times New Roman" w:hAnsi="Times New Roman" w:cs="Times New Roman"/>
-          <w:i w:val="1"/>
-          <w:iCs/>
-          <w:color w:val="000000"/>
-          <w:sz w:val="22"/>
-          <w:szCs w:val="22"/>
-          <w:lang w:eastAsia="en-US"/>
-          <w14:ligatures w14:val="none"/>
-        </w:rPr>
-        <w:t xml:space="preserve">E</w:t>
-      </w:r>
-      <w:r>
-        <w:rPr>
-          <w:rFonts w:ascii="Times New Roman" w:eastAsia="Times New Roman" w:hAnsi="Times New Roman" w:cs="Times New Roman"/>
-          <w:i w:val="1"/>
-          <w:iCs/>
-          <w:color w:val="000000"/>
-          <w:sz w:val="22"/>
-          <w:szCs w:val="22"/>
-          <w:lang w:eastAsia="en-US"/>
-          <w14:ligatures w14:val="none"/>
-        </w:rPr>
-        <w:t xml:space="preserve">.</w:t>
-      </w:r>
-      <w:r>
-        <w:rPr>
-          <w:rFonts w:ascii="Times New Roman" w:eastAsia="Times New Roman" w:hAnsi="Times New Roman" w:cs="Times New Roman"/>
-          <w:i w:val="1"/>
-          <w:iCs/>
-          <w:color w:val="000000"/>
-          <w:sz w:val="22"/>
-          <w:szCs w:val="22"/>
-          <w:lang w:eastAsia="en-US"/>
-          <w14:ligatures w14:val="none"/>
+          <w:b w:val="0"/>
+          <w:i/>
         </w:rPr>
         <w:t xml:space="preserve"> variegata</w:t>
       </w:r>
       <w:r>
         <w:rPr>
-          <w:rFonts w:ascii="Times New Roman" w:eastAsia="Times New Roman" w:hAnsi="Times New Roman" w:cs="Times New Roman"/>
-          <w:color w:val="000000"/>
-          <w:sz w:val="22"/>
-          <w:szCs w:val="22"/>
-          <w:lang w:eastAsia="en-US"/>
-          <w14:ligatures w14:val="none"/>
+          <w:b w:val="0"/>
+          <w:i w:val="0"/>
         </w:rPr>
         <w:t xml:space="preserve"> galls induced by </w:t>
       </w:r>
       <w:r>
         <w:rPr>
-          <w:rFonts w:ascii="Times New Roman" w:eastAsia="Times New Roman" w:hAnsi="Times New Roman" w:cs="Times New Roman"/>
-          <w:i w:val="1"/>
-          <w:iCs/>
-          <w:color w:val="000000"/>
-          <w:sz w:val="22"/>
-          <w:szCs w:val="22"/>
-          <w:lang w:eastAsia="en-US"/>
-          <w14:ligatures w14:val="none"/>
+          <w:b w:val="0"/>
+          <w:i/>
         </w:rPr>
-        <w:t xml:space="preserve">Q</w:t>
+        <w:t>Q</w:t>
       </w:r>
       <w:r>
         <w:rPr>
-          <w:rFonts w:ascii="Times New Roman" w:eastAsia="Times New Roman" w:hAnsi="Times New Roman" w:cs="Times New Roman"/>
-          <w:i w:val="1"/>
-          <w:iCs/>
-          <w:color w:val="000000"/>
-          <w:sz w:val="22"/>
-          <w:szCs w:val="22"/>
-          <w:lang w:eastAsia="en-US"/>
-          <w14:ligatures w14:val="none"/>
+          <w:b w:val="0"/>
+          <w:i/>
         </w:rPr>
-        <w:t xml:space="preserve">.</w:t>
+        <w:t>.</w:t>
       </w:r>
       <w:r>
         <w:rPr>
-          <w:rFonts w:ascii="Times New Roman" w:eastAsia="Times New Roman" w:hAnsi="Times New Roman" w:cs="Times New Roman"/>
-          <w:i w:val="1"/>
-          <w:iCs/>
-          <w:color w:val="000000"/>
-          <w:sz w:val="22"/>
-          <w:szCs w:val="22"/>
-          <w:lang w:eastAsia="en-US"/>
-          <w14:ligatures w14:val="none"/>
+          <w:b w:val="0"/>
+          <w:i/>
         </w:rPr>
         <w:t xml:space="preserve"> erythrinae</w:t>
       </w:r>
       <w:r>
         <w:rPr>
-          <w:rFonts w:ascii="Times New Roman" w:eastAsia="Times New Roman" w:hAnsi="Times New Roman" w:cs="Times New Roman"/>
-          <w:color w:val="000000"/>
-          <w:sz w:val="22"/>
-          <w:szCs w:val="22"/>
-          <w:lang w:eastAsia="en-US"/>
-          <w14:ligatures w14:val="none"/>
+          <w:b w:val="0"/>
+          <w:i w:val="0"/>
         </w:rPr>
-        <w:t xml:space="preserve">. Image cropped from Lin et al. [9], Fig. 1B (CC BY 4.0). (b) Separate larva–pupa and galled–ungalled petiole comparisons from a single tree sampled once in Taipei, Taiwan, in November 2020. Each insect stage comprised three pools of 10 individuals from different galled petioles; each plant condition comprised three whole-petiole replicates (GP, galled; UP, ungalled)</w:t>
-      </w:r>
-      <w:r>
-        <w:rPr>
-          <w:rFonts w:ascii="Times New Roman" w:hAnsi="Times New Roman" w:cs="Times New Roman"/>
-          <w:sz w:val="22"/>
-        </w:rPr>
-        <w:t>.</w:t>
+        <w:t>. Image cropped from Lin et al. [9], Fig. 1B (CC BY 4.0). (b) Separate larva–pupa and galled–ungalled petiole comparisons from a single tree sampled once in Taipei, Taiwan, in November 2020. Each insect stage comprised three pools of 10 individuals from different galled petioles; each plant condition comprised three whole-petiole replicates (GP, galled; UP, ungalled).</w:t>
       </w:r>
     </w:p>
     <w:p>
       <w:pPr>
         <w:pStyle w:val="Caption"/>
-        <w:keepNext w:val="0"/>
-        <w:keepLines/>
-        <w:spacing w:line="276" w:lineRule="auto" w:before="0" w:after="160"/>
-        <w:rPr>
-          <w:rFonts w:ascii="Times New Roman" w:hAnsi="Times New Roman" w:cs="Times New Roman"/>
-        </w:rPr>
       </w:pPr>
       <w:r>
         <w:rPr>
-          <w:rFonts w:ascii="Times New Roman" w:hAnsi="Times New Roman" w:cs="Times New Roman"/>
-          <w:sz w:val="22"/>
+          <w:b w:val="0"/>
+          <w:i w:val="0"/>
         </w:rPr>
-        <w:t xml:space="preserve">Fig. 2. </w:t>
+        <w:t xml:space="preserve">Fig. 2. Representative GO terms and KEGG pathways enriched among larva-up and pupa-up genes in </w:t>
       </w:r>
       <w:r>
         <w:rPr>
-          <w:rFonts w:ascii="Times New Roman" w:eastAsia="Times New Roman" w:hAnsi="Times New Roman" w:cs="Times New Roman"/>
-          <w:color w:val="000000"/>
-          <w:sz w:val="22"/>
-          <w:lang w:eastAsia="en-US"/>
-          <w14:ligatures w14:val="none"/>
+          <w:b w:val="0"/>
+          <w:i/>
         </w:rPr>
-        <w:t xml:space="preserve">Representative GO terms and KEGG pathways enriched among larva-up and pupa-up genes in </w:t>
+        <w:t>Q</w:t>
       </w:r>
       <w:r>
         <w:rPr>
-          <w:rFonts w:ascii="Times New Roman" w:eastAsia="Times New Roman" w:hAnsi="Times New Roman" w:cs="Times New Roman"/>
-          <w:i w:val="1"/>
-          <w:color w:val="000000"/>
-          <w:sz w:val="22"/>
-          <w:lang w:eastAsia="en-US"/>
-          <w14:ligatures w14:val="none"/>
+          <w:b w:val="0"/>
+          <w:i/>
         </w:rPr>
-        <w:t xml:space="preserve">Q</w:t>
+        <w:t>.</w:t>
       </w:r>
       <w:r>
         <w:rPr>
-          <w:rFonts w:ascii="Times New Roman" w:eastAsia="Times New Roman" w:hAnsi="Times New Roman" w:cs="Times New Roman"/>
-          <w:i w:val="1"/>
-          <w:color w:val="000000"/>
-          <w:sz w:val="22"/>
-          <w:lang w:eastAsia="en-US"/>
-          <w14:ligatures w14:val="none"/>
-        </w:rPr>
-        <w:t xml:space="preserve">.</w:t>
-      </w:r>
-      <w:r>
-        <w:rPr>
-          <w:rFonts w:ascii="Times New Roman" w:eastAsia="Times New Roman" w:hAnsi="Times New Roman" w:cs="Times New Roman"/>
-          <w:i w:val="1"/>
-          <w:color w:val="000000"/>
-          <w:sz w:val="22"/>
-          <w:lang w:eastAsia="en-US"/>
-          <w14:ligatures w14:val="none"/>
+          <w:b w:val="0"/>
+          <w:i/>
         </w:rPr>
         <w:t xml:space="preserve"> erythrinae</w:t>
       </w:r>
       <w:r>
         <w:rPr>
-          <w:rFonts w:ascii="Times New Roman" w:eastAsia="Times New Roman" w:hAnsi="Times New Roman" w:cs="Times New Roman"/>
-          <w:color w:val="000000"/>
-          <w:sz w:val="22"/>
-          <w:lang w:eastAsia="en-US"/>
-          <w14:ligatures w14:val="none"/>
+          <w:b w:val="0"/>
+          <w:i w:val="0"/>
         </w:rPr>
         <w:t xml:space="preserve">. (a) Larva-up GO terms. (b) Larva-up KEGG pathways. (c) Pupa-up GO terms. (d) Pupa-up KEGG pathways. Larval and pupal categories are shown in green and pink, respectively. Bars show the percentage of GO- or KEGG-annotated genes in each directional gene set assigned to the indicated category; labels show gene counts. All displayed categories had BH-adjusted </w:t>
       </w:r>
       <w:r>
         <w:rPr>
-          <w:rFonts w:ascii="Times New Roman" w:eastAsia="Times New Roman" w:hAnsi="Times New Roman" w:cs="Times New Roman"/>
-          <w:i w:val="1"/>
-          <w:iCs/>
-          <w:color w:val="000000"/>
-          <w:sz w:val="22"/>
-          <w:lang w:eastAsia="en-US"/>
-          <w14:ligatures w14:val="none"/>
+          <w:b w:val="0"/>
+          <w:i/>
         </w:rPr>
-        <w:t xml:space="preserve">P</w:t>
+        <w:t>P</w:t>
       </w:r>
       <w:r>
         <w:rPr>
-          <w:rFonts w:ascii="Times New Roman" w:eastAsia="Times New Roman" w:hAnsi="Times New Roman" w:cs="Times New Roman"/>
-          <w:color w:val="000000"/>
-          <w:sz w:val="22"/>
-          <w:lang w:eastAsia="en-US"/>
-          <w14:ligatures w14:val="none"/>
+          <w:b w:val="0"/>
+          <w:i w:val="0"/>
         </w:rPr>
-        <w:t xml:space="preserve"> &lt; 0.05. Representative categories were selected to reduce redundancy, although categories may share contributing genes. Complete results are provided in </w:t>
-      </w:r>
-      <w:r>
-        <w:rPr>
-          <w:rFonts w:ascii="Times New Roman" w:eastAsia="Times New Roman" w:hAnsi="Times New Roman" w:cs="Times New Roman"/>
-          <w:color w:val="000000"/>
-          <w:sz w:val="22"/>
-          <w:lang w:eastAsia="en-US"/>
-          <w14:ligatures w14:val="none"/>
-        </w:rPr>
-        <w:t>Supplementary Tables S4 and S5</w:t>
-      </w:r>
-      <w:r>
-        <w:rPr>
-          <w:rFonts w:ascii="Times New Roman" w:hAnsi="Times New Roman" w:cs="Times New Roman"/>
-          <w:sz w:val="22"/>
-        </w:rPr>
-        <w:t>.</w:t>
+        <w:t xml:space="preserve"> &lt; 0.05. Representative categories were selected to reduce redundancy, although categories may share contributing genes. Complete results are provided in Supplementary Tables S4 and S5.</w:t>
       </w:r>
     </w:p>
     <w:p>
       <w:pPr>
         <w:pStyle w:val="Caption"/>
-        <w:keepNext w:val="0"/>
-        <w:keepLines/>
-        <w:spacing w:line="276" w:lineRule="auto" w:before="0" w:after="160"/>
       </w:pPr>
       <w:r>
         <w:rPr>
-          <w:sz w:val="22"/>
+          <w:b w:val="0"/>
+          <w:i w:val="0"/>
         </w:rPr>
-        <w:t xml:space="preserve">Fig. 3. </w:t>
+        <w:t xml:space="preserve">Fig. 3. Predicted classical-secretome and focused candidate-family profiles in </w:t>
       </w:r>
       <w:r>
         <w:rPr>
-          <w:color w:val="000000"/>
-          <w:sz w:val="22"/>
-          <w:lang w:eastAsia="en-US"/>
+          <w:b w:val="0"/>
+          <w:i/>
         </w:rPr>
-        <w:t xml:space="preserve">Predicted classical-secretome and focused candidate-family profiles in </w:t>
+        <w:t>Q. erythrinae</w:t>
       </w:r>
       <w:r>
         <w:rPr>
-          <w:i w:val="1"/>
-          <w:color w:val="000000"/>
-          <w:sz w:val="22"/>
-          <w:lang w:eastAsia="en-US"/>
+          <w:b w:val="0"/>
+          <w:i w:val="0"/>
         </w:rPr>
-        <w:t xml:space="preserve">Q. erythrinae</w:t>
+        <w:t>. (a) Classification of 13,455 representative proteins using SignalP and DeepTMHMM. (b) Expression status of the 2,039 proteins meeting the conservative classical-secretome criterion: a predicted SignalP signal peptide and no predicted DeepTMHMM transmembrane region. (c) Expression status within five focused candidate-family inventories. (d) Mean normalized counts for the 14 focused-family genes that were both larva-up and predicted classical-secretome candidates. In (b) and (c), green and pink indicate larva-up and pupa-up genes, respectively. Points in (d) are uniformly green; bracketed abbreviations identify candidate families, and numerical labels show unshrunk log</w:t>
       </w:r>
       <w:r>
         <w:rPr>
-          <w:color w:val="000000"/>
-          <w:sz w:val="22"/>
-          <w:lang w:eastAsia="en-US"/>
-        </w:rPr>
-        <w:t xml:space="preserve">. (a) Classification of 13,455 representative proteins using </w:t>
-      </w:r>
-      <w:proofErr w:type="spellStart"/>
-      <w:r>
-        <w:rPr>
-          <w:color w:val="000000"/>
-          <w:sz w:val="22"/>
-          <w:lang w:eastAsia="en-US"/>
-        </w:rPr>
-        <w:t>SignalP</w:t>
-      </w:r>
-      <w:proofErr w:type="spellEnd"/>
-      <w:r>
-        <w:rPr>
-          <w:color w:val="000000"/>
-          <w:sz w:val="22"/>
-          <w:lang w:eastAsia="en-US"/>
-        </w:rPr>
-        <w:t xml:space="preserve"> and </w:t>
-      </w:r>
-      <w:proofErr w:type="spellStart"/>
-      <w:r>
-        <w:rPr>
-          <w:color w:val="000000"/>
-          <w:sz w:val="22"/>
-          <w:lang w:eastAsia="en-US"/>
-        </w:rPr>
-        <w:t>DeepTMHMM</w:t>
-      </w:r>
-      <w:proofErr w:type="spellEnd"/>
-      <w:r>
-        <w:rPr>
-          <w:color w:val="000000"/>
-          <w:sz w:val="22"/>
-          <w:lang w:eastAsia="en-US"/>
-        </w:rPr>
-        <w:t xml:space="preserve">. (b) Expression status of the 2,039 proteins meeting the conservative classical-secretome criterion: a predicted </w:t>
-      </w:r>
-      <w:proofErr w:type="spellStart"/>
-      <w:r>
-        <w:rPr>
-          <w:color w:val="000000"/>
-          <w:sz w:val="22"/>
-          <w:lang w:eastAsia="en-US"/>
-        </w:rPr>
-        <w:t>SignalP</w:t>
-      </w:r>
-      <w:proofErr w:type="spellEnd"/>
-      <w:r>
-        <w:rPr>
-          <w:color w:val="000000"/>
-          <w:sz w:val="22"/>
-          <w:lang w:eastAsia="en-US"/>
-        </w:rPr>
-        <w:t xml:space="preserve"> signal peptide and no predicted </w:t>
-      </w:r>
-      <w:proofErr w:type="spellStart"/>
-      <w:r>
-        <w:rPr>
-          <w:color w:val="000000"/>
-          <w:sz w:val="22"/>
-          <w:lang w:eastAsia="en-US"/>
-        </w:rPr>
-        <w:t>DeepTMHMM</w:t>
-      </w:r>
-      <w:proofErr w:type="spellEnd"/>
-      <w:r>
-        <w:rPr>
-          <w:color w:val="000000"/>
-          <w:sz w:val="22"/>
-          <w:lang w:eastAsia="en-US"/>
-        </w:rPr>
-        <w:t xml:space="preserve"> transmembrane region. (c) Expression status within five focused candidate-family inventories. (d) Mean normalized counts for the 14 focused-family genes that were both larva-up and classical-secretome candidates. In (b) and (c), green and pink indicate larva-up and pupa-up genes, respectively. Points in (d) are uniformly green; bracketed abbreviations identify candidate families, and numerical labels show unshrunk log</w:t>
-      </w:r>
-      <w:r>
-        <w:rPr>
-          <w:color w:val="000000"/>
-          <w:sz w:val="22"/>
-          <w:vertAlign w:val="subscript"/>
-          <w:lang w:eastAsia="en-US"/>
-        </w:rPr>
-        <w:t>2</w:t>
-      </w:r>
-      <w:r>
-        <w:rPr>
-          <w:color w:val="000000"/>
-          <w:sz w:val="22"/>
-          <w:lang w:eastAsia="en-US"/>
-        </w:rPr>
-        <w:t xml:space="preserve"> fold changes for pupa versus larva. </w:t>
-      </w:r>
-      <w:r>
-        <w:rPr>
-          <w:color w:val="000000"/>
-          <w:sz w:val="22"/>
-          <w:lang w:eastAsia="en-US"/>
-        </w:rPr>
-        <w:lastRenderedPageBreak/>
-        <w:t xml:space="preserve">Differential expression required adjusted </w:t>
-      </w:r>
-      <w:r>
-        <w:rPr>
-          <w:i w:val="1"/>
-          <w:iCs/>
-          <w:color w:val="000000"/>
-          <w:sz w:val="22"/>
-          <w:lang w:eastAsia="en-US"/>
-        </w:rPr>
-        <w:t xml:space="preserve">P</w:t>
-      </w:r>
-      <w:r>
-        <w:rPr>
-          <w:color w:val="000000"/>
-          <w:sz w:val="22"/>
-          <w:lang w:eastAsia="en-US"/>
-        </w:rPr>
-        <w:t xml:space="preserve"> &lt; 0.01 and |log</w:t>
-      </w:r>
-      <w:r>
-        <w:rPr>
-          <w:color w:val="000000"/>
-          <w:sz w:val="22"/>
-          <w:vertAlign w:val="subscript"/>
-          <w:lang w:eastAsia="en-US"/>
-        </w:rPr>
-        <w:t>2</w:t>
-      </w:r>
-      <w:r>
-        <w:rPr>
-          <w:color w:val="000000"/>
-          <w:sz w:val="22"/>
-          <w:lang w:eastAsia="en-US"/>
-        </w:rPr>
-        <w:t xml:space="preserve"> fold change| ≥ 1. Non-DE genes did not meet both criteria; low-count exclusions and unavailable adjusted </w:t>
-      </w:r>
-      <w:r>
-        <w:rPr>
-          <w:color w:val="000000"/>
-          <w:sz w:val="22"/>
-          <w:lang w:eastAsia="en-US"/>
-          <w:i w:val="1"/>
-        </w:rPr>
-        <w:t xml:space="preserve">P</w:t>
-      </w:r>
-      <w:r>
-        <w:rPr>
-          <w:color w:val="000000"/>
-          <w:sz w:val="22"/>
-          <w:lang w:eastAsia="en-US"/>
-        </w:rPr>
-        <w:t xml:space="preserve"> values are shown separately. Classical-secretome classification predicts entry into the classical secretory pathway; extracellular localization and effector activity remain to be tested</w:t>
-      </w:r>
-      <w:r>
-        <w:rPr>
-          <w:sz w:val="22"/>
-        </w:rPr>
-        <w:t>.</w:t>
-      </w:r>
-    </w:p>
-    <w:p>
-      <w:pPr>
-        <w:pStyle w:val="Caption"/>
-        <w:keepNext w:val="0"/>
-        <w:keepLines/>
-        <w:spacing w:line="276" w:lineRule="auto" w:before="0" w:after="160"/>
-        <w:rPr>
-          <w:rFonts w:ascii="Times New Roman" w:hAnsi="Times New Roman" w:cs="Times New Roman"/>
-        </w:rPr>
-      </w:pPr>
-      <w:r>
-        <w:rPr>
-          <w:rFonts w:ascii="Times New Roman" w:hAnsi="Times New Roman" w:cs="Times New Roman"/>
-          <w:sz w:val="22"/>
-        </w:rPr>
-        <w:t xml:space="preserve">Fig. 4. </w:t>
-      </w:r>
-      <w:r>
-        <w:rPr>
-          <w:rFonts w:ascii="Times New Roman" w:eastAsia="Times New Roman" w:hAnsi="Times New Roman" w:cs="Times New Roman"/>
-          <w:color w:val="000000"/>
-          <w:sz w:val="22"/>
-          <w:lang w:eastAsia="en-US"/>
-          <w14:ligatures w14:val="none"/>
-        </w:rPr>
-        <w:t xml:space="preserve">Representative functional enrichment associated with differential expression in galled and ungalled </w:t>
-      </w:r>
-      <w:r>
-        <w:rPr>
-          <w:rFonts w:ascii="Times New Roman" w:eastAsia="Times New Roman" w:hAnsi="Times New Roman" w:cs="Times New Roman"/>
-          <w:i w:val="1"/>
-          <w:color w:val="000000"/>
-          <w:sz w:val="22"/>
-          <w:lang w:eastAsia="en-US"/>
-          <w14:ligatures w14:val="none"/>
-        </w:rPr>
-        <w:t xml:space="preserve">E</w:t>
-      </w:r>
-      <w:r>
-        <w:rPr>
-          <w:rFonts w:ascii="Times New Roman" w:eastAsia="Times New Roman" w:hAnsi="Times New Roman" w:cs="Times New Roman"/>
-          <w:i w:val="1"/>
-          <w:color w:val="000000"/>
-          <w:sz w:val="22"/>
-          <w:lang w:eastAsia="en-US"/>
-          <w14:ligatures w14:val="none"/>
-        </w:rPr>
-        <w:t xml:space="preserve">.</w:t>
-      </w:r>
-      <w:r>
-        <w:rPr>
-          <w:rFonts w:ascii="Times New Roman" w:eastAsia="Times New Roman" w:hAnsi="Times New Roman" w:cs="Times New Roman"/>
-          <w:i w:val="1"/>
-          <w:color w:val="000000"/>
-          <w:sz w:val="22"/>
-          <w:lang w:eastAsia="en-US"/>
-          <w14:ligatures w14:val="none"/>
-        </w:rPr>
-        <w:t xml:space="preserve"> variegata</w:t>
-      </w:r>
-      <w:r>
-        <w:rPr>
-          <w:rFonts w:ascii="Times New Roman" w:eastAsia="Times New Roman" w:hAnsi="Times New Roman" w:cs="Times New Roman"/>
-          <w:color w:val="000000"/>
-          <w:sz w:val="22"/>
-          <w:lang w:eastAsia="en-US"/>
-          <w14:ligatures w14:val="none"/>
-        </w:rPr>
-        <w:t xml:space="preserve"> petioles. Currently resolved GO terms and significant KEGG pathways are shown for GP-up genes (a, b; blue) and UP-up genes (c, d; orange). Bars indicate the percentage of annotation-eligible genes in each directional set assigned to a category, and labels show gene counts. All displayed categories had BH-adjusted </w:t>
-      </w:r>
-      <w:r>
-        <w:rPr>
-          <w:rFonts w:ascii="Times New Roman" w:eastAsia="Times New Roman" w:hAnsi="Times New Roman" w:cs="Times New Roman"/>
-          <w:i w:val="1"/>
-          <w:iCs/>
-          <w:color w:val="000000"/>
-          <w:sz w:val="22"/>
-          <w:lang w:eastAsia="en-US"/>
-          <w14:ligatures w14:val="none"/>
-        </w:rPr>
-        <w:t xml:space="preserve">P</w:t>
-      </w:r>
-      <w:r>
-        <w:rPr>
-          <w:rFonts w:ascii="Times New Roman" w:eastAsia="Times New Roman" w:hAnsi="Times New Roman" w:cs="Times New Roman"/>
-          <w:color w:val="000000"/>
-          <w:sz w:val="22"/>
-          <w:lang w:eastAsia="en-US"/>
-          <w14:ligatures w14:val="none"/>
-        </w:rPr>
-        <w:t xml:space="preserve"> &lt; 0.05. Redundant GO terms were omitted from the figure but retained in Supplementary Table S11. The broad KEGG category metabolic pathways and the category chemical carcinogenesis-DNA adducts were omitted from panel b but retained in Supplementary Table S12. The latter shares all 14 GP-up contributing genes with metabolism of xenobiotics by cytochrome P450 and therefore does not provide an independent gene-level enrichment signal</w:t>
-      </w:r>
-      <w:r>
-        <w:rPr>
-          <w:rFonts w:ascii="Times New Roman" w:hAnsi="Times New Roman" w:cs="Times New Roman"/>
-          <w:sz w:val="22"/>
-        </w:rPr>
-        <w:t>.</w:t>
-      </w:r>
-    </w:p>
-    <w:p>
-      <w:pPr>
-        <w:pStyle w:val="Caption"/>
-        <w:keepNext w:val="0"/>
-        <w:keepLines/>
-        <w:spacing w:line="276" w:lineRule="auto" w:before="0" w:after="160"/>
-        <w:rPr>
-          <w:rFonts w:ascii="Times New Roman" w:hAnsi="Times New Roman" w:cs="Times New Roman"/>
-        </w:rPr>
-      </w:pPr>
-      <w:r>
-        <w:rPr>
-          <w:rFonts w:ascii="Times New Roman" w:hAnsi="Times New Roman" w:cs="Times New Roman"/>
-          <w:noProof/>
-          <w:sz w:val="22"/>
-        </w:rPr>
-        <w:lastRenderedPageBreak/>
-      </w:r>
-      <w:r>
-        <w:rPr>
-          <w:rFonts w:ascii="Times New Roman" w:hAnsi="Times New Roman" w:cs="Times New Roman"/>
-          <w:sz w:val="22"/>
-        </w:rPr>
-        <w:t xml:space="preserve">Fig. 5</w:t>
-      </w:r>
-      <w:r>
-        <w:rPr>
-          <w:rFonts w:ascii="Times New Roman" w:hAnsi="Times New Roman" w:cs="Times New Roman"/>
-          <w:sz w:val="22"/>
-        </w:rPr>
-        <w:t xml:space="preserve">. </w:t>
-      </w:r>
-      <w:r>
-        <w:rPr>
-          <w:rFonts w:ascii="Times New Roman" w:hAnsi="Times New Roman" w:cs="Times New Roman"/>
-          <w:sz w:val="22"/>
-        </w:rPr>
-        <w:t>Expression patterns within the frozen plant-defense candidate inventory. (</w:t>
-      </w:r>
-      <w:r>
-        <w:rPr>
-          <w:rFonts w:ascii="Times New Roman" w:hAnsi="Times New Roman" w:cs="Times New Roman"/>
-          <w:sz w:val="22"/>
-        </w:rPr>
-        <w:t>a</w:t>
-      </w:r>
-      <w:r>
-        <w:rPr>
-          <w:rFonts w:ascii="Times New Roman" w:hAnsi="Times New Roman" w:cs="Times New Roman"/>
-          <w:sz w:val="22"/>
-        </w:rPr>
-        <w:t>) Final refined-mask expression status of 806 unique candidate genes. (</w:t>
-      </w:r>
-      <w:r>
-        <w:rPr>
-          <w:rFonts w:ascii="Times New Roman" w:hAnsi="Times New Roman" w:cs="Times New Roman"/>
-          <w:sz w:val="22"/>
-        </w:rPr>
-        <w:t>b</w:t>
-      </w:r>
-      <w:r>
-        <w:rPr>
-          <w:rFonts w:ascii="Times New Roman" w:hAnsi="Times New Roman" w:cs="Times New Roman"/>
-          <w:sz w:val="22"/>
-        </w:rPr>
-        <w:t>) Numbers of GP-up and UP-up genes within five overlapping defense groups. Group-specific counts are not additive because some genes belong to multiple groups. (</w:t>
-      </w:r>
-      <w:r>
-        <w:rPr>
-          <w:rFonts w:ascii="Times New Roman" w:hAnsi="Times New Roman" w:cs="Times New Roman"/>
-          <w:sz w:val="22"/>
-        </w:rPr>
-        <w:t>c</w:t>
-      </w:r>
-      <w:r>
-        <w:rPr>
-          <w:rFonts w:ascii="Times New Roman" w:hAnsi="Times New Roman" w:cs="Times New Roman"/>
-          <w:sz w:val="22"/>
-        </w:rPr>
-        <w:t xml:space="preserve">) Selected GP-up candidates that were </w:t>
-      </w:r>
-      <w:proofErr w:type="spellStart"/>
-      <w:r>
-        <w:rPr>
-          <w:rFonts w:ascii="Times New Roman" w:hAnsi="Times New Roman" w:cs="Times New Roman"/>
-          <w:sz w:val="22"/>
-        </w:rPr>
-        <w:t>SignalP</w:t>
-      </w:r>
-      <w:proofErr w:type="spellEnd"/>
-      <w:r>
-        <w:rPr>
-          <w:rFonts w:ascii="Times New Roman" w:hAnsi="Times New Roman" w:cs="Times New Roman"/>
-          <w:sz w:val="22"/>
-        </w:rPr>
-        <w:t xml:space="preserve">-positive and lacked a predicted transmembrane region. Points are colored by candidate class, and labels show log₂ fold change for GP versus UP. </w:t>
-      </w:r>
-      <w:r>
-        <w:rPr>
-          <w:rFonts w:ascii="Times New Roman" w:hAnsi="Times New Roman" w:cs="Times New Roman"/>
-          <w:sz w:val="22"/>
-        </w:rPr>
-        <w:t>The dashed line marks log</w:t>
-      </w:r>
-      <w:r>
-        <w:rPr>
-          <w:rFonts w:ascii="Times New Roman" w:hAnsi="Times New Roman" w:cs="Times New Roman"/>
-          <w:sz w:val="22"/>
+          <w:b w:val="0"/>
+          <w:i w:val="0"/>
           <w:vertAlign w:val="subscript"/>
         </w:rPr>
         <w:t>2</w:t>
       </w:r>
       <w:r>
         <w:rPr>
-          <w:rFonts w:ascii="Times New Roman" w:hAnsi="Times New Roman" w:cs="Times New Roman"/>
-          <w:sz w:val="22"/>
+          <w:b w:val="0"/>
+          <w:i w:val="0"/>
         </w:rPr>
-        <w:t xml:space="preserve"> fold change = 1</w:t>
+        <w:t xml:space="preserve"> fold changes for pupa versus larva. DEG classification required BH-adjusted </w:t>
       </w:r>
       <w:r>
         <w:rPr>
-          <w:rFonts w:ascii="Times New Roman" w:hAnsi="Times New Roman" w:cs="Times New Roman"/>
-          <w:sz w:val="22"/>
+          <w:b w:val="0"/>
+          <w:i/>
         </w:rPr>
-        <w:t>.</w:t>
+        <w:t>P</w:t>
       </w:r>
       <w:r>
         <w:rPr>
-          <w:rFonts w:ascii="Times New Roman" w:hAnsi="Times New Roman" w:cs="Times New Roman"/>
-          <w:sz w:val="22"/>
+          <w:b w:val="0"/>
+          <w:i w:val="0"/>
         </w:rPr>
-        <w:t xml:space="preserve"> </w:t>
+        <w:t xml:space="preserve"> &lt; 0.01 and an absolute estimated, unshrunk log</w:t>
       </w:r>
-      <w:proofErr w:type="spellStart"/>
       <w:r>
         <w:rPr>
-          <w:rFonts w:ascii="Times New Roman" w:hAnsi="Times New Roman" w:cs="Times New Roman"/>
-          <w:sz w:val="22"/>
+          <w:b w:val="0"/>
+          <w:i w:val="0"/>
+          <w:vertAlign w:val="subscript"/>
         </w:rPr>
-        <w:t>SignalP</w:t>
+        <w:t>2</w:t>
       </w:r>
-      <w:proofErr w:type="spellEnd"/>
       <w:r>
         <w:rPr>
-          <w:rFonts w:ascii="Times New Roman" w:hAnsi="Times New Roman" w:cs="Times New Roman"/>
-          <w:sz w:val="22"/>
+          <w:b w:val="0"/>
+          <w:i w:val="0"/>
         </w:rPr>
-        <w:t>-positive/no-transmembrane-region classification indicates predicted entry into the classical secretory pathway, not confirmed extracellular localization or biological activity.</w:t>
+        <w:t xml:space="preserve"> fold change ≥ 1. Non-DE genes did not meet both criteria; low-count exclusions and unavailable adjusted </w:t>
+      </w:r>
+      <w:r>
+        <w:rPr>
+          <w:b w:val="0"/>
+          <w:i/>
+        </w:rPr>
+        <w:t>P</w:t>
+      </w:r>
+      <w:r>
+        <w:rPr>
+          <w:b w:val="0"/>
+          <w:i w:val="0"/>
+        </w:rPr>
+        <w:t xml:space="preserve"> values are shown separately. Classical-secretome classification predicts entry into the classical secretory pathway; extracellular localization and effector activity remain to be tested.</w:t>
       </w:r>
     </w:p>
     <w:p>
       <w:pPr>
         <w:pStyle w:val="Caption"/>
-        <w:keepNext w:val="0"/>
-        <w:keepLines/>
-        <w:spacing w:line="276" w:lineRule="auto" w:before="0" w:after="160"/>
-        <w:rPr>
-          <w:rFonts w:ascii="Times New Roman" w:hAnsi="Times New Roman" w:cs="Times New Roman"/>
-        </w:rPr>
       </w:pPr>
       <w:r>
         <w:rPr>
-          <w:rFonts w:ascii="Times New Roman" w:hAnsi="Times New Roman" w:cs="Times New Roman"/>
-          <w:sz w:val="22"/>
+          <w:b w:val="0"/>
+          <w:i w:val="0"/>
         </w:rPr>
-        <w:t xml:space="preserve">Fig. 6</w:t>
+        <w:t xml:space="preserve">Fig. 4. Representative functional enrichment associated with differential expression in galled and ungalled </w:t>
       </w:r>
       <w:r>
         <w:rPr>
-          <w:rFonts w:ascii="Times New Roman" w:hAnsi="Times New Roman" w:cs="Times New Roman"/>
-          <w:sz w:val="22"/>
+          <w:b w:val="0"/>
+          <w:i/>
         </w:rPr>
-        <w:t xml:space="preserve">. </w:t>
+        <w:t>E. variegata</w:t>
       </w:r>
       <w:r>
         <w:rPr>
-          <w:rFonts w:ascii="Times New Roman" w:eastAsia="Times New Roman" w:hAnsi="Times New Roman" w:cs="Times New Roman"/>
-          <w:color w:val="000000"/>
-          <w:sz w:val="22"/>
-          <w:szCs w:val="22"/>
-          <w:lang w:eastAsia="en-US"/>
-          <w14:ligatures w14:val="none"/>
+          <w:b w:val="0"/>
+          <w:i w:val="0"/>
         </w:rPr>
-        <w:t xml:space="preserve">Stage-associated insect inhibitor-family homologs and GP-up plant peptidase candidates. (a) Expression-status distribution of 149 curated classical-secretome insect inhibitor-family homologs across 18 MEROPS families. (b) Nine larva-up candidates with the expected </w:t>
-      </w:r>
-      <w:proofErr w:type="spellStart"/>
-      <w:r>
-        <w:rPr>
-          <w:rFonts w:ascii="Times New Roman" w:eastAsia="Times New Roman" w:hAnsi="Times New Roman" w:cs="Times New Roman"/>
-          <w:color w:val="000000"/>
-          <w:sz w:val="22"/>
-          <w:szCs w:val="22"/>
-          <w:lang w:eastAsia="en-US"/>
-          <w14:ligatures w14:val="none"/>
-        </w:rPr>
-        <w:t>Pfam</w:t>
-      </w:r>
-      <w:proofErr w:type="spellEnd"/>
-      <w:r>
-        <w:rPr>
-          <w:rFonts w:ascii="Times New Roman" w:eastAsia="Times New Roman" w:hAnsi="Times New Roman" w:cs="Times New Roman"/>
-          <w:color w:val="000000"/>
-          <w:sz w:val="22"/>
-          <w:szCs w:val="22"/>
-          <w:lang w:eastAsia="en-US"/>
-          <w14:ligatures w14:val="none"/>
-        </w:rPr>
-        <w:t xml:space="preserve">-family support. Negative log₂ fold changes represent higher larval transcript abundance in the </w:t>
+        <w:t xml:space="preserve"> petioles. Currently resolved GO terms and significant KEGG pathways are shown for GP-up genes (a, b; blue) and UP-up genes (c, d; orange). Bars indicate the percentage of annotation-eligible Trinity gene clusters in each directional set assigned to a category, and labels show cluster counts. All displayed categories had BH-adjusted </w:t>
       </w:r>
       <w:r>
         <w:rPr>
-          <w:rFonts w:ascii="Times New Roman" w:eastAsia="Times New Roman" w:hAnsi="Times New Roman" w:cs="Times New Roman"/>
-          <w:color w:val="000000"/>
-          <w:sz w:val="22"/>
-          <w:szCs w:val="22"/>
-          <w:lang w:eastAsia="en-US"/>
-          <w14:ligatures w14:val="none"/>
+          <w:b w:val="0"/>
+          <w:i/>
         </w:rPr>
-        <w:t xml:space="preserve">pupa-versus-larva contrast. (c) Nineteen priority plant peptidase candidates retained as GP-up after the final refined-mask DESeq2 analysis. Positive log₂ fold changes represent higher GP transcript abundance in the GP-versus-UP contrast. Candidates in (b) and (c) are colored green and blue, respectively; adjacent codes identify MEROPS families. Stems in these panels connect estimates to zero and are not confidence intervals. (d) Pupa-up representation of the complete curated insect inhibitor set and the Tier-A named-reference subset. Points show odds ratios and horizontal lines show 95% confidence intervals. Dashed lines mark log₂ fold changes of −1 in (b) and +1 in (c), and an odds ratio of 1 in (d). Non-DE genes did not meet adjusted </w:t>
+        <w:t>P</w:t>
       </w:r>
       <w:r>
         <w:rPr>
-          <w:rFonts w:ascii="Times New Roman" w:eastAsia="Times New Roman" w:hAnsi="Times New Roman" w:cs="Times New Roman"/>
-          <w:color w:val="000000"/>
-          <w:sz w:val="22"/>
-          <w:szCs w:val="22"/>
-          <w:lang w:eastAsia="en-US"/>
-          <w14:ligatures w14:val="none"/>
-          <w:i w:val="1"/>
+          <w:b w:val="0"/>
+          <w:i w:val="0"/>
         </w:rPr>
-        <w:t xml:space="preserve">P</w:t>
+        <w:t xml:space="preserve"> &lt; 0.05. Redundant GO terms were omitted from the figure but retained in Supplementary Table S11. The broad KEGG category metabolic pathways and the category chemical carcinogenesis-DNA adducts were omitted from panel b but retained in Supplementary Table S12. The latter shares all 14 GP-up contributing genes with metabolism of xenobiotics by cytochrome P450 and therefore does not provide an independent gene-level enrichment signal.</w:t>
+      </w:r>
+    </w:p>
+    <w:p>
+      <w:pPr>
+        <w:pStyle w:val="Caption"/>
+      </w:pPr>
+      <w:r>
+        <w:rPr>
+          <w:b w:val="0"/>
+          <w:i w:val="0"/>
+        </w:rPr>
+        <w:t>Fig. 5. Expression patterns within the annotation-based plant-defense candidate inventory. Membership was frozen before the final refined-mask expression overlay. (a) Final expression status of all 806 candidate Trinity gene clusters. (b) Numbers of GP-up and UP-up candidates within five overlapping groups from this inventory. Group-specific counts are not additive because some candidates belong to multiple groups. (c) Ten selected GP-up predicted classical-secretome candidates from the inventory. Candidates were SignalP-positive and lacked a predicted transmembrane region. Points are colored by candidate class, and labels show unshrunk log</w:t>
       </w:r>
       <w:r>
         <w:rPr>
-          <w:rFonts w:ascii="Times New Roman" w:eastAsia="Times New Roman" w:hAnsi="Times New Roman" w:cs="Times New Roman"/>
-          <w:color w:val="000000"/>
-          <w:sz w:val="22"/>
-          <w:szCs w:val="22"/>
-          <w:lang w:eastAsia="en-US"/>
-          <w14:ligatures w14:val="none"/>
-        </w:rPr>
-        <w:t xml:space="preserve"> &lt; 0.01 and |log</w:t>
-      </w:r>
-      <w:r>
-        <w:rPr>
-          <w:rFonts w:ascii="Times New Roman" w:eastAsia="Times New Roman" w:hAnsi="Times New Roman" w:cs="Times New Roman"/>
-          <w:color w:val="000000"/>
-          <w:sz w:val="22"/>
-          <w:szCs w:val="22"/>
+          <w:b w:val="0"/>
+          <w:i w:val="0"/>
           <w:vertAlign w:val="subscript"/>
-          <w:lang w:eastAsia="en-US"/>
-          <w14:ligatures w14:val="none"/>
         </w:rPr>
         <w:t>2</w:t>
       </w:r>
       <w:r>
         <w:rPr>
-          <w:rFonts w:ascii="Times New Roman" w:eastAsia="Times New Roman" w:hAnsi="Times New Roman" w:cs="Times New Roman"/>
-          <w:color w:val="000000"/>
-          <w:sz w:val="22"/>
-          <w:szCs w:val="22"/>
-          <w:lang w:eastAsia="en-US"/>
-          <w14:ligatures w14:val="none"/>
+          <w:b w:val="0"/>
+          <w:i w:val="0"/>
         </w:rPr>
-        <w:t xml:space="preserve"> fold change| ≥ 1; low-count exclusions and unavailable adjusted </w:t>
+        <w:t xml:space="preserve"> fold changes for GP versus UP. The dashed line marks log</w:t>
       </w:r>
       <w:r>
         <w:rPr>
-          <w:rFonts w:ascii="Times New Roman" w:eastAsia="Times New Roman" w:hAnsi="Times New Roman" w:cs="Times New Roman"/>
-          <w:color w:val="000000"/>
-          <w:sz w:val="22"/>
-          <w:szCs w:val="22"/>
-          <w:lang w:eastAsia="en-US"/>
-          <w14:ligatures w14:val="none"/>
-          <w:i w:val="1"/>
+          <w:b w:val="0"/>
+          <w:i w:val="0"/>
+          <w:vertAlign w:val="subscript"/>
         </w:rPr>
-        <w:t xml:space="preserve">P</w:t>
+        <w:t>2</w:t>
       </w:r>
       <w:r>
         <w:rPr>
-          <w:rFonts w:ascii="Times New Roman" w:eastAsia="Times New Roman" w:hAnsi="Times New Roman" w:cs="Times New Roman"/>
-          <w:color w:val="000000"/>
-          <w:sz w:val="22"/>
-          <w:szCs w:val="22"/>
-          <w:lang w:eastAsia="en-US"/>
-          <w14:ligatures w14:val="none"/>
+          <w:b w:val="0"/>
+          <w:i w:val="0"/>
         </w:rPr>
-        <w:t xml:space="preserve"> values are separate categories. GP, galled petiole; UP, ungalled petiole. These homology-based profiles identify candidates for biochemical testing</w:t>
+        <w:t xml:space="preserve"> fold change = 1. The topology predictions indicate entry into the classical secretory pathway; extracellular localization and biological activity remain untested.</w:t>
+      </w:r>
+    </w:p>
+    <w:p>
+      <w:pPr>
+        <w:pStyle w:val="Caption"/>
+      </w:pPr>
+      <w:r>
+        <w:rPr>
+          <w:b w:val="0"/>
+          <w:i w:val="0"/>
+        </w:rPr>
+        <w:t>Fig. 6. Stage-associated insect inhibitor-family homologs and prioritized GP-up plant peptidase candidates. (a) Expression-status distribution of 149 curated insect inhibitor-family homologs across 18 MEROPS families, selected from 2,039 predicted classical-secretome candidates after screening the complete representative proteome. (b) Nine of the 23 larva-up inhibitor-family homologs with the expected Pfam-family support. Negative log</w:t>
       </w:r>
       <w:r>
         <w:rPr>
-          <w:rFonts w:ascii="Times New Roman" w:hAnsi="Times New Roman" w:cs="Times New Roman"/>
-          <w:sz w:val="22"/>
+          <w:b w:val="0"/>
+          <w:i w:val="0"/>
+          <w:vertAlign w:val="subscript"/>
         </w:rPr>
-        <w:t>.</w:t>
+        <w:t>2</w:t>
+      </w:r>
+      <w:r>
+        <w:rPr>
+          <w:b w:val="0"/>
+          <w:i w:val="0"/>
+        </w:rPr>
+        <w:t xml:space="preserve"> fold changes represent higher larval transcript abundance in the pupa-versus-larva contrast. (c) Nineteen of 20 priority plant peptidase candidates retained as GP-up after the final refined-mask analysis. The 20 candidates were curated from the original GP-up predicted classical-secretome search, and each represents a Trinity gene cluster. Positive log</w:t>
+      </w:r>
+      <w:r>
+        <w:rPr>
+          <w:b w:val="0"/>
+          <w:i w:val="0"/>
+          <w:vertAlign w:val="subscript"/>
+        </w:rPr>
+        <w:t>2</w:t>
+      </w:r>
+      <w:r>
+        <w:rPr>
+          <w:b w:val="0"/>
+          <w:i w:val="0"/>
+        </w:rPr>
+        <w:t xml:space="preserve"> fold changes represent higher GP transcript abundance. Candidates in (b) and (c) are colored green and blue, respectively; adjacent codes identify MEROPS families. Stems connect estimates to zero and are not confidence intervals. (d) Pupa-up versus larva-up odds ratios for the curated inhibitor set (91 DEGs among 149 members) and Tier-A named-reference subset (47 DEGs among 64 members), compared with the remaining predicted classical-secretome DEGs (1,050 and 1,094, respectively). Points show odds ratios and horizontal lines show 95% confidence intervals. Dashed lines mark log</w:t>
+      </w:r>
+      <w:r>
+        <w:rPr>
+          <w:b w:val="0"/>
+          <w:i w:val="0"/>
+          <w:vertAlign w:val="subscript"/>
+        </w:rPr>
+        <w:t>2</w:t>
+      </w:r>
+      <w:r>
+        <w:rPr>
+          <w:b w:val="0"/>
+          <w:i w:val="0"/>
+        </w:rPr>
+        <w:t xml:space="preserve"> fold changes of −1 in (b) and +1 in (c), and an odds ratio of 1 in (d). Non-DE genes did not meet both DEG criteria (BH-adjusted </w:t>
+      </w:r>
+      <w:r>
+        <w:rPr>
+          <w:b w:val="0"/>
+          <w:i/>
+        </w:rPr>
+        <w:t>P</w:t>
+      </w:r>
+      <w:r>
+        <w:rPr>
+          <w:b w:val="0"/>
+          <w:i w:val="0"/>
+        </w:rPr>
+        <w:t xml:space="preserve"> &lt; 0.01 and an absolute estimated, unshrunk log</w:t>
+      </w:r>
+      <w:r>
+        <w:rPr>
+          <w:b w:val="0"/>
+          <w:i w:val="0"/>
+          <w:vertAlign w:val="subscript"/>
+        </w:rPr>
+        <w:t>2</w:t>
+      </w:r>
+      <w:r>
+        <w:rPr>
+          <w:b w:val="0"/>
+          <w:i w:val="0"/>
+        </w:rPr>
+        <w:t xml:space="preserve"> fold change ≥ 1); low-count exclusions and unavailable adjusted </w:t>
+      </w:r>
+      <w:r>
+        <w:rPr>
+          <w:b w:val="0"/>
+          <w:i/>
+        </w:rPr>
+        <w:t>P</w:t>
+      </w:r>
+      <w:r>
+        <w:rPr>
+          <w:b w:val="0"/>
+          <w:i w:val="0"/>
+        </w:rPr>
+        <w:t xml:space="preserve"> values are separate categories. GP, galled petiole; UP, ungalled petiole. The independently selected insect and plant inventories do not identify interacting inhibitor–peptidase pairs.</w:t>
       </w:r>
     </w:p>
     <w:sectPr>
-      <w:footerReference w:type="default" r:id="rId9"/>
       <w:pgSz w:w="12240" w:h="15840"/>
       <w:pgMar w:top="1152" w:right="1224" w:bottom="1152" w:left="1224" w:header="720" w:footer="720" w:gutter="0"/>
       <w:cols w:space="720"/>
@@ -864,18 +410,6 @@
     </w:sectPr>
   </w:body>
 </w:document>
-</file>
-
-<file path=word/footer1.xml><?xml version="1.0" encoding="utf-8"?>
-<w:ftr xmlns:m="http://schemas.openxmlformats.org/officeDocument/2006/math" xmlns:mc="http://schemas.openxmlformats.org/markup-compatibility/2006" xmlns:mo="http://schemas.microsoft.com/office/mac/office/2008/main" xmlns:mv="urn:schemas-microsoft-com:mac:vml" xmlns:o="urn:schemas-microsoft-com:office:office" xmlns:r="http://schemas.openxmlformats.org/officeDocument/2006/relationships" xmlns:v="urn:schemas-microsoft-com:vml" xmlns:w10="urn:schemas-microsoft-com:office:word" xmlns:w14="http://schemas.microsoft.com/office/word/2010/wordml" xmlns:w="http://schemas.openxmlformats.org/wordprocessingml/2006/main" xmlns:wne="http://schemas.microsoft.com/office/word/2006/wordml" xmlns:wp14="http://schemas.microsoft.com/office/word/2010/wordprocessingDrawing" xmlns:wp="http://schemas.openxmlformats.org/drawingml/2006/wordprocessingDrawing" xmlns:wpc="http://schemas.microsoft.com/office/word/2010/wordprocessingCanvas" xmlns:wpg="http://schemas.microsoft.com/office/word/2010/wordprocessingGroup" xmlns:wpi="http://schemas.microsoft.com/office/word/2010/wordprocessingInk" xmlns:wps="http://schemas.microsoft.com/office/word/2010/wordprocessingShape" mc:Ignorable="w14 wp14">
-  <w:p>
-    <w:pPr>
-      <w:pStyle w:val="Footer"/>
-      <w:jc w:val="center"/>
-    </w:pPr>
-    <w:fldSimple w:instr="PAGE"/>
-  </w:p>
-</w:ftr>
 </file>
 
 <file path=word/numbering.xml><?xml version="1.0" encoding="utf-8"?>
@@ -1241,13 +775,9 @@
     <w:name w:val="Normal"/>
     <w:qFormat/>
     <w:rsid w:val="00FC693F"/>
-    <w:pPr>
-      <w:spacing w:line="276" w:lineRule="auto" w:after="240"/>
-    </w:pPr>
     <w:rPr>
-      <w:rFonts w:ascii="Times New Roman" w:hAnsi="Times New Roman"/>
+      <w:rFonts w:ascii="Times New Roman" w:hAnsi="Times New Roman" w:eastAsia="Times New Roman" w:cs="Times New Roman"/>
       <w:b w:val="0"/>
-      <w:bCs w:val="0"/>
       <w:i w:val="0"/>
       <w:color w:val="000000"/>
       <w:sz w:val="22"/>
@@ -1594,13 +1124,12 @@
     <w:qFormat/>
     <w:rsid w:val="00FC693F"/>
     <w:pPr>
-      <w:spacing w:after="240" w:line="276" w:lineRule="auto"/>
+      <w:spacing w:after="240" w:line="240" w:lineRule="auto"/>
       <w:contextualSpacing/>
     </w:pPr>
     <w:rPr>
-      <w:rFonts w:ascii="Times New Roman" w:hAnsi="Times New Roman"/>
+      <w:rFonts w:ascii="Times New Roman" w:hAnsi="Times New Roman" w:eastAsia="Times New Roman" w:cs="Times New Roman"/>
       <w:b/>
-      <w:bCs/>
       <w:i w:val="0"/>
       <w:color w:val="000000"/>
       <w:spacing w:val="5"/>
@@ -2040,12 +1569,13 @@
     <w:qFormat/>
     <w:rsid w:val="00FC693F"/>
     <w:pPr>
-      <w:spacing w:line="276" w:lineRule="auto" w:after="240"/>
+      <w:widowControl/>
+      <w:spacing w:line="276" w:lineRule="auto" w:after="160"/>
     </w:pPr>
     <w:rPr>
-      <w:rFonts w:ascii="Times New Roman" w:hAnsi="Times New Roman"/>
+      <w:rFonts w:ascii="Times New Roman" w:hAnsi="Times New Roman" w:eastAsia="Times New Roman" w:cs="Times New Roman"/>
       <w:b w:val="0"/>
-      <w:bCs w:val="0"/>
+      <w:bCs/>
       <w:i w:val="0"/>
       <w:color w:val="000000"/>
       <w:sz w:val="22"/>

</xml_diff>